<commit_message>
added para on stratified sampling
</commit_message>
<xml_diff>
--- a/a2_Hannah_Taylor_40443054/csc2026_a2_Hannah_Taylor_40443054.docx
+++ b/a2_Hannah_Taylor_40443054/csc2026_a2_Hannah_Taylor_40443054.docx
@@ -183,14 +183,7 @@
           <w:rStyle w:val="citation-115"/>
           <w:color w:val="000000"/>
         </w:rPr>
-        <w:t>S</w:t>
-      </w:r>
-      <w:r>
-        <w:rPr>
-          <w:rStyle w:val="citation-115"/>
-          <w:color w:val="000000"/>
-        </w:rPr>
-        <w:t>ection 1 focuses on</w:t>
+        <w:t>Section 1 focuses on</w:t>
       </w:r>
       <w:r>
         <w:rPr>
@@ -688,6 +681,70 @@
           <w:shd w:val="clear" w:color="auto" w:fill="FFFFFF"/>
         </w:rPr>
       </w:pPr>
+      <w:r>
+        <w:rPr>
+          <w:rFonts w:cs="Calibri"/>
+          <w:color w:val="000000"/>
+          <w:shd w:val="clear" w:color="auto" w:fill="FFFFFF"/>
+        </w:rPr>
+        <w:t xml:space="preserve">Stratified sampling is used to makes sure that the test set is like a ‘mini’ version of the original data set, in that </w:t>
+      </w:r>
+      <w:r>
+        <w:rPr>
+          <w:rFonts w:cs="Calibri"/>
+          <w:color w:val="000000"/>
+          <w:shd w:val="clear" w:color="auto" w:fill="FFFFFF"/>
+        </w:rPr>
+        <w:t>“</w:t>
+      </w:r>
+      <w:r>
+        <w:rPr>
+          <w:rFonts w:cs="Calibri"/>
+          <w:color w:val="000000"/>
+          <w:shd w:val="clear" w:color="auto" w:fill="FFFFFF"/>
+        </w:rPr>
+        <w:t>the proportion of values in the sample produced will be the same as the proportion of values provided by parameter stratify</w:t>
+      </w:r>
+      <w:r>
+        <w:rPr>
+          <w:rFonts w:cs="Calibri"/>
+          <w:color w:val="000000"/>
+          <w:shd w:val="clear" w:color="auto" w:fill="FFFFFF"/>
+        </w:rPr>
+        <w:t>”. [1]</w:t>
+      </w:r>
+      <w:r>
+        <w:rPr>
+          <w:rFonts w:cs="Calibri"/>
+          <w:color w:val="000000"/>
+          <w:shd w:val="clear" w:color="auto" w:fill="FFFFFF"/>
+        </w:rPr>
+        <w:t xml:space="preserve"> </w:t>
+      </w:r>
+      <w:r>
+        <w:rPr>
+          <w:rFonts w:cs="Calibri"/>
+          <w:color w:val="000000"/>
+          <w:shd w:val="clear" w:color="auto" w:fill="FFFFFF"/>
+        </w:rPr>
+        <w:t xml:space="preserve">In this case, using stratify makes sure that in the test set there is an equal number of items from every set (3 </w:t>
+      </w:r>
+      <w:r>
+        <w:rPr>
+          <w:rFonts w:cs="Calibri"/>
+          <w:color w:val="000000"/>
+          <w:shd w:val="clear" w:color="auto" w:fill="FFFFFF"/>
+        </w:rPr>
+        <w:t>items from the 8 classes</w:t>
+      </w:r>
+      <w:r>
+        <w:rPr>
+          <w:rFonts w:cs="Calibri"/>
+          <w:color w:val="000000"/>
+          <w:shd w:val="clear" w:color="auto" w:fill="FFFFFF"/>
+        </w:rPr>
+        <w:t xml:space="preserve"> outlined by assignment spec).</w:t>
+      </w:r>
     </w:p>
     <w:p>
       <w:pPr>
@@ -1074,6 +1131,7 @@
           <w:color w:val="000000"/>
           <w:shd w:val="clear" w:color="auto" w:fill="FFFFFF"/>
         </w:rPr>
+        <w:lastRenderedPageBreak/>
         <w:t>ea</w:t>
       </w:r>
       <w:proofErr w:type="spellEnd"/>
@@ -1497,7 +1555,6 @@
         <w:pStyle w:val="Heading2"/>
       </w:pPr>
       <w:r>
-        <w:lastRenderedPageBreak/>
         <w:t>Section</w:t>
       </w:r>
       <w:r>
@@ -9479,6 +9536,7 @@
           <w:szCs w:val="32"/>
           <w:shd w:val="clear" w:color="auto" w:fill="FFFFFF"/>
         </w:rPr>
+        <w:lastRenderedPageBreak/>
         <w:t>References</w:t>
       </w:r>
     </w:p>
@@ -9496,28 +9554,38 @@
           <w:color w:val="000000"/>
           <w:shd w:val="clear" w:color="auto" w:fill="FFFFFF"/>
         </w:rPr>
-        <w:t>[1</w:t>
-      </w:r>
-      <w:proofErr w:type="gramStart"/>
-      <w:r>
-        <w:rPr>
-          <w:rFonts w:cs="Calibri"/>
-          <w:color w:val="000000"/>
-          <w:shd w:val="clear" w:color="auto" w:fill="FFFFFF"/>
-        </w:rPr>
-        <w:t>].</w:t>
-      </w:r>
-      <w:proofErr w:type="spellStart"/>
-      <w:r>
-        <w:rPr>
-          <w:rFonts w:cs="Calibri"/>
-          <w:color w:val="000000"/>
-          <w:shd w:val="clear" w:color="auto" w:fill="FFFFFF"/>
-        </w:rPr>
-        <w:t>vvvvvvvvvvv</w:t>
-      </w:r>
-      <w:proofErr w:type="spellEnd"/>
-      <w:proofErr w:type="gramEnd"/>
+        <w:t>[1].</w:t>
+      </w:r>
+      <w:r>
+        <w:t xml:space="preserve"> </w:t>
+      </w:r>
+      <w:hyperlink r:id="rId8" w:history="1">
+        <w:r>
+          <w:rPr>
+            <w:rStyle w:val="Hyperlink"/>
+            <w:rFonts w:cs="Calibri"/>
+            <w:shd w:val="clear" w:color="auto" w:fill="FFFFFF"/>
+          </w:rPr>
+          <w:t>https://stackoverflow.com/questions/34842405/parameter-stratify-from-method-train-test-split-scikit-learn</w:t>
+        </w:r>
+      </w:hyperlink>
+    </w:p>
+    <w:p>
+      <w:pPr>
+        <w:rPr>
+          <w:rFonts w:cs="Calibri"/>
+          <w:color w:val="000000"/>
+          <w:shd w:val="clear" w:color="auto" w:fill="FFFFFF"/>
+        </w:rPr>
+      </w:pPr>
+      <w:r>
+        <w:rPr>
+          <w:rFonts w:cs="Calibri"/>
+          <w:color w:val="000000"/>
+          <w:shd w:val="clear" w:color="auto" w:fill="FFFFFF"/>
+        </w:rPr>
+        <w:t>[2].</w:t>
+      </w:r>
     </w:p>
     <w:p>
       <w:pPr>
@@ -9530,8 +9598,8 @@
     </w:p>
     <w:p/>
     <w:sectPr>
-      <w:headerReference w:type="default" r:id="rId8"/>
-      <w:footerReference w:type="default" r:id="rId9"/>
+      <w:headerReference w:type="default" r:id="rId9"/>
+      <w:footerReference w:type="default" r:id="rId10"/>
       <w:pgSz w:w="11906" w:h="16838"/>
       <w:pgMar w:top="1281" w:right="1077" w:bottom="851" w:left="1077" w:header="425" w:footer="147" w:gutter="0"/>
       <w:cols w:space="708"/>
@@ -10550,6 +10618,29 @@
       </w:rPr>
     </w:tblStylePr>
   </w:style>
+  <w:style w:type="character" w:styleId="Hyperlink">
+    <w:name w:val="Hyperlink"/>
+    <w:basedOn w:val="DefaultParagraphFont"/>
+    <w:uiPriority w:val="99"/>
+    <w:unhideWhenUsed/>
+    <w:rsid w:val="00AE45D6"/>
+    <w:rPr>
+      <w:color w:val="467886" w:themeColor="hyperlink"/>
+      <w:u w:val="single"/>
+    </w:rPr>
+  </w:style>
+  <w:style w:type="character" w:styleId="UnresolvedMention">
+    <w:name w:val="Unresolved Mention"/>
+    <w:basedOn w:val="DefaultParagraphFont"/>
+    <w:uiPriority w:val="99"/>
+    <w:semiHidden/>
+    <w:unhideWhenUsed/>
+    <w:rsid w:val="00AE45D6"/>
+    <w:rPr>
+      <w:color w:val="605E5C"/>
+      <w:shd w:val="clear" w:color="auto" w:fill="E1DFDD"/>
+    </w:rPr>
+  </w:style>
 </w:styles>
 </file>
 
@@ -10869,6 +10960,15 @@
 </file>
 
 <file path=customXml/item1.xml><?xml version="1.0" encoding="utf-8"?>
+<?mso-contentType ?>
+<FormTemplates xmlns="http://schemas.microsoft.com/sharepoint/v3/contenttype/forms">
+  <Display>DocumentLibraryForm</Display>
+  <Edit>DocumentLibraryForm</Edit>
+  <New>DocumentLibraryForm</New>
+</FormTemplates>
+</file>
+
+<file path=customXml/item2.xml><?xml version="1.0" encoding="utf-8"?>
 <ct:contentTypeSchema xmlns:ct="http://schemas.microsoft.com/office/2006/metadata/contentType" xmlns:ma="http://schemas.microsoft.com/office/2006/metadata/properties/metaAttributes" ct:_="" ma:_="" ma:contentTypeName="Document" ma:contentTypeID="0x0101008BD36978BB4F4F488BD5FA448C313402" ma:contentTypeVersion="0" ma:contentTypeDescription="Create a new document." ma:contentTypeScope="" ma:versionID="a10212fdc8c798de08937403dc893db2">
   <xsd:schema xmlns:xsd="http://www.w3.org/2001/XMLSchema" xmlns:xs="http://www.w3.org/2001/XMLSchema" xmlns:p="http://schemas.microsoft.com/office/2006/metadata/properties" targetNamespace="http://schemas.microsoft.com/office/2006/metadata/properties" ma:root="true" ma:fieldsID="1b05d82d297216baf5b26c55225140df">
     <xsd:element name="properties">
@@ -10982,16 +11082,15 @@
 </ct:contentTypeSchema>
 </file>
 
-<file path=customXml/item2.xml><?xml version="1.0" encoding="utf-8"?>
-<?mso-contentType ?>
-<FormTemplates xmlns="http://schemas.microsoft.com/sharepoint/v3/contenttype/forms">
-  <Display>DocumentLibraryForm</Display>
-  <Edit>DocumentLibraryForm</Edit>
-  <New>DocumentLibraryForm</New>
-</FormTemplates>
+<file path=customXml/itemProps1.xml><?xml version="1.0" encoding="utf-8"?>
+<ds:datastoreItem xmlns:ds="http://schemas.openxmlformats.org/officeDocument/2006/customXml" ds:itemID="{18D30BCF-9665-46B6-99ED-05DA9414D515}">
+  <ds:schemaRefs>
+    <ds:schemaRef ds:uri="http://schemas.microsoft.com/sharepoint/v3/contenttype/forms"/>
+  </ds:schemaRefs>
+</ds:datastoreItem>
 </file>
 
-<file path=customXml/itemProps1.xml><?xml version="1.0" encoding="utf-8"?>
+<file path=customXml/itemProps2.xml><?xml version="1.0" encoding="utf-8"?>
 <ds:datastoreItem xmlns:ds="http://schemas.openxmlformats.org/officeDocument/2006/customXml" ds:itemID="{AC5B8B2E-791D-4959-8714-61617878BE64}">
   <ds:schemaRefs>
     <ds:schemaRef ds:uri="http://schemas.microsoft.com/office/2006/metadata/contentType"/>
@@ -11005,12 +11104,4 @@
     <ds:schemaRef ds:uri="http://schemas.microsoft.com/office/infopath/2007/PartnerControls"/>
   </ds:schemaRefs>
 </ds:datastoreItem>
-</file>
-
-<file path=customXml/itemProps2.xml><?xml version="1.0" encoding="utf-8"?>
-<ds:datastoreItem xmlns:ds="http://schemas.openxmlformats.org/officeDocument/2006/customXml" ds:itemID="{18D30BCF-9665-46B6-99ED-05DA9414D515}">
-  <ds:schemaRefs>
-    <ds:schemaRef ds:uri="http://schemas.microsoft.com/sharepoint/v3/contenttype/forms"/>
-  </ds:schemaRefs>
-</ds:datastoreItem>
 </file>
</xml_diff>

<commit_message>
finalised task 3.3 and conclusion
</commit_message>
<xml_diff>
--- a/a2_Hannah_Taylor_40443054/csc2026_a2_Hannah_Taylor_40443054.docx
+++ b/a2_Hannah_Taylor_40443054/csc2026_a2_Hannah_Taylor_40443054.docx
@@ -107,7 +107,19 @@
         <w:rPr>
           <w:sz w:val="28"/>
         </w:rPr>
-        <w:t>[Date]</w:t>
+        <w:t>[</w:t>
+      </w:r>
+      <w:r>
+        <w:rPr>
+          <w:sz w:val="28"/>
+        </w:rPr>
+        <w:t>20/04/26</w:t>
+      </w:r>
+      <w:r>
+        <w:rPr>
+          <w:sz w:val="28"/>
+        </w:rPr>
+        <w:t>]</w:t>
       </w:r>
     </w:p>
     <w:p>
@@ -140,7 +152,25 @@
           <w:color w:val="000000"/>
           <w:shd w:val="clear" w:color="auto" w:fill="FFFFFF"/>
         </w:rPr>
-        <w:t>Specifically, classifiers are fitted and evaluated for the image data, in order to see whether the models can predict the class labels for unseen images.</w:t>
+        <w:t xml:space="preserve">Specifically, classifiers are fitted and evaluated for the image data, </w:t>
+      </w:r>
+      <w:proofErr w:type="gramStart"/>
+      <w:r>
+        <w:rPr>
+          <w:rFonts w:cs="Calibri"/>
+          <w:color w:val="000000"/>
+          <w:shd w:val="clear" w:color="auto" w:fill="FFFFFF"/>
+        </w:rPr>
+        <w:t>in order to</w:t>
+      </w:r>
+      <w:proofErr w:type="gramEnd"/>
+      <w:r>
+        <w:rPr>
+          <w:rFonts w:cs="Calibri"/>
+          <w:color w:val="000000"/>
+          <w:shd w:val="clear" w:color="auto" w:fill="FFFFFF"/>
+        </w:rPr>
+        <w:t xml:space="preserve"> see whether the models can predict the class labels for unseen images.</w:t>
       </w:r>
     </w:p>
     <w:p>
@@ -1176,7 +1206,25 @@
           <w:color w:val="000000"/>
           <w:shd w:val="clear" w:color="auto" w:fill="FFFFFF"/>
         </w:rPr>
-        <w:t>The high test accuracy (91.7%) shows that the model generalises well to new data.</w:t>
+        <w:t xml:space="preserve">The </w:t>
+      </w:r>
+      <w:proofErr w:type="gramStart"/>
+      <w:r>
+        <w:rPr>
+          <w:rFonts w:cs="Calibri"/>
+          <w:color w:val="000000"/>
+          <w:shd w:val="clear" w:color="auto" w:fill="FFFFFF"/>
+        </w:rPr>
+        <w:t>high test</w:t>
+      </w:r>
+      <w:proofErr w:type="gramEnd"/>
+      <w:r>
+        <w:rPr>
+          <w:rFonts w:cs="Calibri"/>
+          <w:color w:val="000000"/>
+          <w:shd w:val="clear" w:color="auto" w:fill="FFFFFF"/>
+        </w:rPr>
+        <w:t xml:space="preserve"> accuracy (91.7%) shows that the model generalises well to new data.</w:t>
       </w:r>
       <w:r>
         <w:rPr>
@@ -1351,7 +1399,25 @@
           <w:color w:val="000000"/>
           <w:shd w:val="clear" w:color="auto" w:fill="FFFFFF"/>
         </w:rPr>
-        <w:t xml:space="preserve"> In the results data frame in the code, a pencil item was identified as living. This may be due to that particular item having similar features as, for example, a banana item, meaning that the model incorrectly classified it.</w:t>
+        <w:t xml:space="preserve"> In the results data frame in the code, a pencil item was identified as living. This may be due to that </w:t>
+      </w:r>
+      <w:proofErr w:type="gramStart"/>
+      <w:r>
+        <w:rPr>
+          <w:rFonts w:cs="Calibri"/>
+          <w:color w:val="000000"/>
+          <w:shd w:val="clear" w:color="auto" w:fill="FFFFFF"/>
+        </w:rPr>
+        <w:t>particular item</w:t>
+      </w:r>
+      <w:proofErr w:type="gramEnd"/>
+      <w:r>
+        <w:rPr>
+          <w:rFonts w:cs="Calibri"/>
+          <w:color w:val="000000"/>
+          <w:shd w:val="clear" w:color="auto" w:fill="FFFFFF"/>
+        </w:rPr>
+        <w:t xml:space="preserve"> having similar features as, for example, a banana item, meaning that the model incorrectly classified it.</w:t>
       </w:r>
     </w:p>
     <w:p>
@@ -1844,7 +1910,25 @@
           <w:color w:val="000000"/>
           <w:shd w:val="clear" w:color="auto" w:fill="FFFFFF"/>
         </w:rPr>
-        <w:t>is over-eager, similar to the previous model.</w:t>
+        <w:t xml:space="preserve">is over-eager, </w:t>
+      </w:r>
+      <w:proofErr w:type="gramStart"/>
+      <w:r>
+        <w:rPr>
+          <w:rFonts w:cs="Calibri"/>
+          <w:color w:val="000000"/>
+          <w:shd w:val="clear" w:color="auto" w:fill="FFFFFF"/>
+        </w:rPr>
+        <w:t>similar to</w:t>
+      </w:r>
+      <w:proofErr w:type="gramEnd"/>
+      <w:r>
+        <w:rPr>
+          <w:rFonts w:cs="Calibri"/>
+          <w:color w:val="000000"/>
+          <w:shd w:val="clear" w:color="auto" w:fill="FFFFFF"/>
+        </w:rPr>
+        <w:t xml:space="preserve"> the previous model.</w:t>
       </w:r>
       <w:r>
         <w:rPr>
@@ -2058,7 +2142,25 @@
           <w:color w:val="000000"/>
           <w:shd w:val="clear" w:color="auto" w:fill="FFFFFF"/>
         </w:rPr>
-        <w:t xml:space="preserve"> It has a AUC (area under curve) value of approximately 99%, showing that there is 99% chance the model will be able to distinguish between a living and non-living object.</w:t>
+        <w:t xml:space="preserve"> It has </w:t>
+      </w:r>
+      <w:proofErr w:type="gramStart"/>
+      <w:r>
+        <w:rPr>
+          <w:rFonts w:cs="Calibri"/>
+          <w:color w:val="000000"/>
+          <w:shd w:val="clear" w:color="auto" w:fill="FFFFFF"/>
+        </w:rPr>
+        <w:t>a</w:t>
+      </w:r>
+      <w:proofErr w:type="gramEnd"/>
+      <w:r>
+        <w:rPr>
+          <w:rFonts w:cs="Calibri"/>
+          <w:color w:val="000000"/>
+          <w:shd w:val="clear" w:color="auto" w:fill="FFFFFF"/>
+        </w:rPr>
+        <w:t xml:space="preserve"> AUC (area under curve) value of approximately 99%, showing that there is 99% chance the model will be able to distinguish between a living and non-living object.</w:t>
       </w:r>
     </w:p>
     <w:p>
@@ -2223,7 +2325,15 @@
         <w:t xml:space="preserve"> [2] </w:t>
       </w:r>
       <w:r>
-        <w:t xml:space="preserve">In the KNN algorithm, k is a number that tells the algorithm how many nearby points or neighbours to look at when it makes a decision. </w:t>
+        <w:t xml:space="preserve">In the KNN algorithm, k is a number that tells the algorithm how many nearby points or neighbours to look at when it </w:t>
+      </w:r>
+      <w:proofErr w:type="gramStart"/>
+      <w:r>
+        <w:t>makes a decision</w:t>
+      </w:r>
+      <w:proofErr w:type="gramEnd"/>
+      <w:r>
+        <w:t xml:space="preserve">. </w:t>
       </w:r>
     </w:p>
     <w:p>
@@ -2319,6 +2429,7 @@
             <w:r>
               <w:rPr>
                 <w:rFonts w:cs="Calibri"/>
+                <w:noProof/>
                 <w:color w:val="000000"/>
                 <w:shd w:val="clear" w:color="auto" w:fill="FFFFFF"/>
               </w:rPr>
@@ -2406,31 +2517,7 @@
                 <w:szCs w:val="16"/>
                 <w:shd w:val="clear" w:color="auto" w:fill="FFFFFF"/>
               </w:rPr>
-              <w:t xml:space="preserve"> - </w:t>
-            </w:r>
-            <w:r>
-              <w:rPr>
-                <w:rFonts w:cs="Calibri"/>
-                <w:b/>
-                <w:bCs/>
-                <w:color w:val="000000"/>
-                <w:sz w:val="16"/>
-                <w:szCs w:val="16"/>
-                <w:shd w:val="clear" w:color="auto" w:fill="FFFFFF"/>
-              </w:rPr>
-              <w:t xml:space="preserve">KNN accuracy vs k value </w:t>
-            </w:r>
-            <w:r>
-              <w:rPr>
-                <w:rFonts w:cs="Calibri"/>
-                <w:b/>
-                <w:bCs/>
-                <w:color w:val="000000"/>
-                <w:sz w:val="16"/>
-                <w:szCs w:val="16"/>
-                <w:shd w:val="clear" w:color="auto" w:fill="FFFFFF"/>
-              </w:rPr>
-              <w:t>table</w:t>
+              <w:t xml:space="preserve"> - KNN accuracy vs k value table</w:t>
             </w:r>
           </w:p>
         </w:tc>
@@ -2454,7 +2541,7 @@
                 <w:shd w:val="clear" w:color="auto" w:fill="FFFFFF"/>
               </w:rPr>
               <w:drawing>
-                <wp:inline distT="0" distB="0" distL="0" distR="0" wp14:anchorId="2E9CC5BA" wp14:editId="46958797">
+                <wp:inline distT="0" distB="0" distL="0" distR="0" wp14:anchorId="2E9CC5BA" wp14:editId="128A5DF3">
                   <wp:extent cx="2937600" cy="1836000"/>
                   <wp:effectExtent l="0" t="0" r="0" b="5715"/>
                   <wp:docPr id="355584563" name="Picture 5"/>
@@ -2600,7 +2687,25 @@
           <w:color w:val="000000"/>
           <w:shd w:val="clear" w:color="auto" w:fill="FFFFFF"/>
         </w:rPr>
-        <w:t>strong and can correctly classify the majority of the objects into the correct class.</w:t>
+        <w:t xml:space="preserve">strong and can correctly classify </w:t>
+      </w:r>
+      <w:proofErr w:type="gramStart"/>
+      <w:r>
+        <w:rPr>
+          <w:rFonts w:cs="Calibri"/>
+          <w:color w:val="000000"/>
+          <w:shd w:val="clear" w:color="auto" w:fill="FFFFFF"/>
+        </w:rPr>
+        <w:t>the majority of</w:t>
+      </w:r>
+      <w:proofErr w:type="gramEnd"/>
+      <w:r>
+        <w:rPr>
+          <w:rFonts w:cs="Calibri"/>
+          <w:color w:val="000000"/>
+          <w:shd w:val="clear" w:color="auto" w:fill="FFFFFF"/>
+        </w:rPr>
+        <w:t xml:space="preserve"> the objects into the correct class.</w:t>
       </w:r>
       <w:r>
         <w:rPr>
@@ -2740,6 +2845,9 @@
           </w:tcPr>
           <w:p>
             <w:r>
+              <w:rPr>
+                <w:noProof/>
+              </w:rPr>
               <w:drawing>
                 <wp:inline distT="0" distB="0" distL="0" distR="0" wp14:anchorId="4884D09E" wp14:editId="4E13AF50">
                   <wp:extent cx="2952000" cy="1617379"/>
@@ -2804,16 +2912,7 @@
                 <w:sz w:val="15"/>
                 <w:szCs w:val="15"/>
               </w:rPr>
-              <w:t xml:space="preserve">KNN 7-fold cross validation accuracy vs k value </w:t>
-            </w:r>
-            <w:r>
-              <w:rPr>
-                <w:b/>
-                <w:bCs/>
-                <w:sz w:val="15"/>
-                <w:szCs w:val="15"/>
-              </w:rPr>
-              <w:t>table</w:t>
+              <w:t>KNN 7-fold cross validation accuracy vs k value table</w:t>
             </w:r>
           </w:p>
         </w:tc>
@@ -2827,7 +2926,7 @@
                 <w:noProof/>
               </w:rPr>
               <w:drawing>
-                <wp:inline distT="0" distB="0" distL="0" distR="0" wp14:anchorId="2A69B9C6" wp14:editId="47A248D3">
+                <wp:inline distT="0" distB="0" distL="0" distR="0" wp14:anchorId="2A69B9C6" wp14:editId="57988DF2">
                   <wp:extent cx="2960640" cy="1850400"/>
                   <wp:effectExtent l="0" t="0" r="0" b="3810"/>
                   <wp:docPr id="897183781" name="Picture 6"/>
@@ -2981,10 +3080,7 @@
         <w:t xml:space="preserve">This will be used to observe which pairs of classes are the most difficult to discriminate between and why this confusion occurs. </w:t>
       </w:r>
       <w:r>
-        <w:t xml:space="preserve">The best value of k in this </w:t>
-      </w:r>
-      <w:r>
-        <w:t xml:space="preserve">model according to the </w:t>
+        <w:t xml:space="preserve">The best value of k in this model according to the </w:t>
       </w:r>
       <w:r>
         <w:t>Cross-validation</w:t>
@@ -3045,6 +3141,9 @@
           </w:tcPr>
           <w:p>
             <w:r>
+              <w:rPr>
+                <w:noProof/>
+              </w:rPr>
               <w:lastRenderedPageBreak/>
               <w:drawing>
                 <wp:inline distT="0" distB="0" distL="0" distR="0" wp14:anchorId="6FA31F63" wp14:editId="13248295">
@@ -3120,7 +3219,15 @@
           <w:p/>
           <w:p>
             <w:r>
-              <w:t xml:space="preserve">The confusion matrix shows that almost all of the 112 images </w:t>
+              <w:t xml:space="preserve">The confusion matrix shows that almost </w:t>
+            </w:r>
+            <w:proofErr w:type="gramStart"/>
+            <w:r>
+              <w:t>all of</w:t>
+            </w:r>
+            <w:proofErr w:type="gramEnd"/>
+            <w:r>
+              <w:t xml:space="preserve"> the 112 images </w:t>
             </w:r>
             <w:r>
               <w:t>were</w:t>
@@ -3513,7 +3620,25 @@
           <w:color w:val="000000"/>
           <w:shd w:val="clear" w:color="auto" w:fill="FFFFFF"/>
         </w:rPr>
-        <w:t xml:space="preserve">. It is the same logic for the stems. The stems of the banana images are shorter and wider, and the stems of the cherry images and longer and thinner, but the number of black pixels in each stem might actually be similar. </w:t>
+        <w:t xml:space="preserve">. It is the same logic for the stems. The stems of the banana images are shorter and wider, and the stems of the cherry images and longer and thinner, but the number of black pixels in each stem might </w:t>
+      </w:r>
+      <w:proofErr w:type="gramStart"/>
+      <w:r>
+        <w:rPr>
+          <w:rFonts w:cs="Calibri"/>
+          <w:color w:val="000000"/>
+          <w:shd w:val="clear" w:color="auto" w:fill="FFFFFF"/>
+        </w:rPr>
+        <w:t>actually be</w:t>
+      </w:r>
+      <w:proofErr w:type="gramEnd"/>
+      <w:r>
+        <w:rPr>
+          <w:rFonts w:cs="Calibri"/>
+          <w:color w:val="000000"/>
+          <w:shd w:val="clear" w:color="auto" w:fill="FFFFFF"/>
+        </w:rPr>
+        <w:t xml:space="preserve"> similar. </w:t>
       </w:r>
       <w:r>
         <w:rPr>
@@ -3545,7 +3670,25 @@
           <w:color w:val="000000"/>
           <w:shd w:val="clear" w:color="auto" w:fill="FFFFFF"/>
         </w:rPr>
-        <w:t xml:space="preserve"> have had a slightly smaller heights than the majority of the bananas, meaning that they were mistaken as the cherry class, which should have a general smaller height than the banana class.</w:t>
+        <w:t xml:space="preserve"> have had a slightly smaller heights than </w:t>
+      </w:r>
+      <w:proofErr w:type="gramStart"/>
+      <w:r>
+        <w:rPr>
+          <w:rFonts w:cs="Calibri"/>
+          <w:color w:val="000000"/>
+          <w:shd w:val="clear" w:color="auto" w:fill="FFFFFF"/>
+        </w:rPr>
+        <w:t>the majority of</w:t>
+      </w:r>
+      <w:proofErr w:type="gramEnd"/>
+      <w:r>
+        <w:rPr>
+          <w:rFonts w:cs="Calibri"/>
+          <w:color w:val="000000"/>
+          <w:shd w:val="clear" w:color="auto" w:fill="FFFFFF"/>
+        </w:rPr>
+        <w:t xml:space="preserve"> the bananas, meaning that they were mistaken as the cherry class, which should have a general smaller height than the banana class.</w:t>
       </w:r>
       <w:r>
         <w:rPr>
@@ -3685,7 +3828,7 @@
                 <w:noProof/>
               </w:rPr>
               <w:drawing>
-                <wp:inline distT="0" distB="0" distL="0" distR="0" wp14:anchorId="68352647" wp14:editId="050B918D">
+                <wp:inline distT="0" distB="0" distL="0" distR="0" wp14:anchorId="68352647" wp14:editId="417F9C36">
                   <wp:extent cx="4003200" cy="2401838"/>
                   <wp:effectExtent l="0" t="0" r="0" b="0"/>
                   <wp:docPr id="1691068488" name="Picture 7"/>
@@ -3817,8 +3960,13 @@
       <w:r>
         <w:t xml:space="preserve">’ model, where it can classify new data relatively well </w:t>
       </w:r>
-      <w:r>
-        <w:t>and also avoid the noise from the smaller k values.</w:t>
+      <w:proofErr w:type="gramStart"/>
+      <w:r>
+        <w:t>and also</w:t>
+      </w:r>
+      <w:proofErr w:type="gramEnd"/>
+      <w:r>
+        <w:t xml:space="preserve"> avoid the noise from the smaller k values.</w:t>
       </w:r>
     </w:p>
     <w:p>
@@ -3882,6 +4030,9 @@
       </w:r>
       <w:r>
         <w:t>For classification, the final answer is the category that most trees vote for (majority voting/wisdom of the crowds).</w:t>
+      </w:r>
+      <w:r>
+        <w:t xml:space="preserve"> [3]</w:t>
       </w:r>
     </w:p>
     <w:p>
@@ -4039,7 +4190,7 @@
                 <w:shd w:val="clear" w:color="auto" w:fill="FFFFFF"/>
               </w:rPr>
               <w:drawing>
-                <wp:inline distT="0" distB="0" distL="0" distR="0" wp14:anchorId="12C2EC91" wp14:editId="0C243328">
+                <wp:inline distT="0" distB="0" distL="0" distR="0" wp14:anchorId="12C2EC91" wp14:editId="0A10CC70">
                   <wp:extent cx="3700800" cy="2960792"/>
                   <wp:effectExtent l="0" t="0" r="0" b="0"/>
                   <wp:docPr id="1485047896" name="Picture 8"/>
@@ -4133,7 +4284,25 @@
           <w:color w:val="000000"/>
           <w:shd w:val="clear" w:color="auto" w:fill="FFFFFF"/>
         </w:rPr>
-        <w:t>In observing the heatmap, it is clear that there is a very good accuracy score across the board, with the lowest accuracy still being above 90% (Nt = 25, Np = 1, accuracy = 90.12%)</w:t>
+        <w:t xml:space="preserve">In observing the heatmap, </w:t>
+      </w:r>
+      <w:proofErr w:type="gramStart"/>
+      <w:r>
+        <w:rPr>
+          <w:rFonts w:cs="Calibri"/>
+          <w:color w:val="000000"/>
+          <w:shd w:val="clear" w:color="auto" w:fill="FFFFFF"/>
+        </w:rPr>
+        <w:t>it is clear that there</w:t>
+      </w:r>
+      <w:proofErr w:type="gramEnd"/>
+      <w:r>
+        <w:rPr>
+          <w:rFonts w:cs="Calibri"/>
+          <w:color w:val="000000"/>
+          <w:shd w:val="clear" w:color="auto" w:fill="FFFFFF"/>
+        </w:rPr>
+        <w:t xml:space="preserve"> is a very good accuracy score across the board, with the lowest accuracy still being above 90% (Nt = 25, Np = 1, accuracy = 90.12%)</w:t>
       </w:r>
       <w:r>
         <w:rPr>
@@ -4182,7 +4351,25 @@
           <w:color w:val="000000"/>
           <w:shd w:val="clear" w:color="auto" w:fill="FFFFFF"/>
         </w:rPr>
-        <w:t xml:space="preserve"> At 375 trees, the errors made by a few individual tree are disregarded by the majority. </w:t>
+        <w:t xml:space="preserve"> At 375 trees, the errors made by a few individual </w:t>
+      </w:r>
+      <w:proofErr w:type="gramStart"/>
+      <w:r>
+        <w:rPr>
+          <w:rFonts w:cs="Calibri"/>
+          <w:color w:val="000000"/>
+          <w:shd w:val="clear" w:color="auto" w:fill="FFFFFF"/>
+        </w:rPr>
+        <w:t>tree</w:t>
+      </w:r>
+      <w:proofErr w:type="gramEnd"/>
+      <w:r>
+        <w:rPr>
+          <w:rFonts w:cs="Calibri"/>
+          <w:color w:val="000000"/>
+          <w:shd w:val="clear" w:color="auto" w:fill="FFFFFF"/>
+        </w:rPr>
+        <w:t xml:space="preserve"> are disregarded by the majority. </w:t>
       </w:r>
     </w:p>
     <w:p>
@@ -4295,6 +4482,391 @@
           <w:shd w:val="clear" w:color="auto" w:fill="FFFFFF"/>
         </w:rPr>
       </w:pPr>
+      <w:r>
+        <w:rPr>
+          <w:rFonts w:cs="Calibri"/>
+          <w:color w:val="000000"/>
+          <w:shd w:val="clear" w:color="auto" w:fill="FFFFFF"/>
+        </w:rPr>
+        <w:t xml:space="preserve">This section looks at how variable the accuracy is across different independent runs of the model. </w:t>
+      </w:r>
+      <w:r>
+        <w:rPr>
+          <w:rFonts w:cs="Calibri"/>
+          <w:color w:val="000000"/>
+          <w:shd w:val="clear" w:color="auto" w:fill="FFFFFF"/>
+        </w:rPr>
+        <w:t>Using the best model from task 3.1 (Nt = 375, Np = 4)</w:t>
+      </w:r>
+      <w:r>
+        <w:rPr>
+          <w:rFonts w:cs="Calibri"/>
+          <w:color w:val="000000"/>
+          <w:shd w:val="clear" w:color="auto" w:fill="FFFFFF"/>
+        </w:rPr>
+        <w:t xml:space="preserve">, </w:t>
+      </w:r>
+      <w:r>
+        <w:rPr>
+          <w:rFonts w:cs="Calibri"/>
+          <w:color w:val="000000"/>
+          <w:shd w:val="clear" w:color="auto" w:fill="FFFFFF"/>
+        </w:rPr>
+        <w:t>the model is refitted 12 times to obtain 12 cross validated accuracy (the random seed is changed each time).</w:t>
+      </w:r>
+      <w:r>
+        <w:rPr>
+          <w:rFonts w:cs="Calibri"/>
+          <w:color w:val="000000"/>
+          <w:shd w:val="clear" w:color="auto" w:fill="FFFFFF"/>
+        </w:rPr>
+        <w:t xml:space="preserve"> The model should show whether it performs significantly better than chance or not using a ones-sample t-test.</w:t>
+      </w:r>
+    </w:p>
+    <w:p>
+      <w:pPr>
+        <w:rPr>
+          <w:rFonts w:cs="Calibri"/>
+          <w:color w:val="000000"/>
+          <w:shd w:val="clear" w:color="auto" w:fill="FFFFFF"/>
+        </w:rPr>
+      </w:pPr>
+      <w:r>
+        <w:rPr>
+          <w:rFonts w:cs="Calibri"/>
+          <w:color w:val="000000"/>
+          <w:shd w:val="clear" w:color="auto" w:fill="FFFFFF"/>
+        </w:rPr>
+        <w:t>The outcome from the code is as follows:</w:t>
+      </w:r>
+    </w:p>
+    <w:p>
+      <w:pPr>
+        <w:pStyle w:val="query-text-line"/>
+        <w:numPr>
+          <w:ilvl w:val="0"/>
+          <w:numId w:val="4"/>
+        </w:numPr>
+        <w:spacing w:before="0" w:beforeAutospacing="0" w:after="0" w:afterAutospacing="0"/>
+        <w:rPr>
+          <w:rFonts w:ascii="Calibri" w:hAnsi="Calibri" w:cs="Calibri"/>
+          <w:sz w:val="22"/>
+          <w:szCs w:val="22"/>
+        </w:rPr>
+      </w:pPr>
+      <w:r>
+        <w:rPr>
+          <w:rFonts w:ascii="Calibri" w:hAnsi="Calibri" w:cs="Calibri"/>
+          <w:sz w:val="22"/>
+          <w:szCs w:val="22"/>
+        </w:rPr>
+        <w:t>Mean Accuracy: 0.9334</w:t>
+      </w:r>
+      <w:r>
+        <w:rPr>
+          <w:rStyle w:val="apple-converted-space"/>
+          <w:rFonts w:ascii="Calibri" w:hAnsi="Calibri" w:cs="Calibri"/>
+          <w:sz w:val="22"/>
+          <w:szCs w:val="22"/>
+        </w:rPr>
+        <w:t> </w:t>
+      </w:r>
+    </w:p>
+    <w:p>
+      <w:pPr>
+        <w:pStyle w:val="query-text-line"/>
+        <w:numPr>
+          <w:ilvl w:val="0"/>
+          <w:numId w:val="4"/>
+        </w:numPr>
+        <w:spacing w:before="0" w:beforeAutospacing="0" w:after="0" w:afterAutospacing="0"/>
+        <w:rPr>
+          <w:rFonts w:ascii="Calibri" w:hAnsi="Calibri" w:cs="Calibri"/>
+          <w:sz w:val="22"/>
+          <w:szCs w:val="22"/>
+        </w:rPr>
+      </w:pPr>
+      <w:r>
+        <w:rPr>
+          <w:rFonts w:ascii="Calibri" w:hAnsi="Calibri" w:cs="Calibri"/>
+          <w:sz w:val="22"/>
+          <w:szCs w:val="22"/>
+        </w:rPr>
+        <w:t>St</w:t>
+      </w:r>
+      <w:r>
+        <w:rPr>
+          <w:rFonts w:ascii="Calibri" w:hAnsi="Calibri" w:cs="Calibri"/>
+          <w:sz w:val="22"/>
+          <w:szCs w:val="22"/>
+        </w:rPr>
+        <w:t>andar</w:t>
+      </w:r>
+      <w:r>
+        <w:rPr>
+          <w:rFonts w:ascii="Calibri" w:hAnsi="Calibri" w:cs="Calibri"/>
+          <w:sz w:val="22"/>
+          <w:szCs w:val="22"/>
+        </w:rPr>
+        <w:t>d Deviation: 0.0007</w:t>
+      </w:r>
+      <w:r>
+        <w:rPr>
+          <w:rStyle w:val="apple-converted-space"/>
+          <w:rFonts w:ascii="Calibri" w:hAnsi="Calibri" w:cs="Calibri"/>
+          <w:sz w:val="22"/>
+          <w:szCs w:val="22"/>
+        </w:rPr>
+        <w:t> </w:t>
+      </w:r>
+    </w:p>
+    <w:p>
+      <w:pPr>
+        <w:pStyle w:val="query-text-line"/>
+        <w:numPr>
+          <w:ilvl w:val="0"/>
+          <w:numId w:val="4"/>
+        </w:numPr>
+        <w:spacing w:before="0" w:beforeAutospacing="0" w:after="0" w:afterAutospacing="0"/>
+        <w:rPr>
+          <w:rFonts w:ascii="Calibri" w:hAnsi="Calibri" w:cs="Calibri"/>
+          <w:sz w:val="22"/>
+          <w:szCs w:val="22"/>
+        </w:rPr>
+      </w:pPr>
+      <w:r>
+        <w:rPr>
+          <w:rFonts w:ascii="Calibri" w:hAnsi="Calibri" w:cs="Calibri"/>
+          <w:sz w:val="22"/>
+          <w:szCs w:val="22"/>
+        </w:rPr>
+        <w:t>T-statistic: 3604.3664</w:t>
+      </w:r>
+      <w:r>
+        <w:rPr>
+          <w:rStyle w:val="apple-converted-space"/>
+          <w:rFonts w:ascii="Calibri" w:hAnsi="Calibri" w:cs="Calibri"/>
+          <w:sz w:val="22"/>
+          <w:szCs w:val="22"/>
+        </w:rPr>
+        <w:t> </w:t>
+      </w:r>
+    </w:p>
+    <w:p>
+      <w:pPr>
+        <w:pStyle w:val="query-text-line"/>
+        <w:numPr>
+          <w:ilvl w:val="0"/>
+          <w:numId w:val="4"/>
+        </w:numPr>
+        <w:spacing w:before="0" w:beforeAutospacing="0" w:after="0" w:afterAutospacing="0"/>
+        <w:rPr>
+          <w:rFonts w:ascii="Calibri" w:hAnsi="Calibri" w:cs="Calibri"/>
+          <w:sz w:val="22"/>
+          <w:szCs w:val="22"/>
+        </w:rPr>
+      </w:pPr>
+      <w:r>
+        <w:rPr>
+          <w:rFonts w:ascii="Calibri" w:hAnsi="Calibri" w:cs="Calibri"/>
+          <w:sz w:val="22"/>
+          <w:szCs w:val="22"/>
+        </w:rPr>
+        <w:t>P-value: 9.4173e-35</w:t>
+      </w:r>
+      <w:r>
+        <w:rPr>
+          <w:rStyle w:val="apple-converted-space"/>
+          <w:rFonts w:ascii="Calibri" w:hAnsi="Calibri" w:cs="Calibri"/>
+          <w:sz w:val="22"/>
+          <w:szCs w:val="22"/>
+        </w:rPr>
+        <w:t> </w:t>
+      </w:r>
+    </w:p>
+    <w:p>
+      <w:pPr>
+        <w:pStyle w:val="query-text-line"/>
+        <w:numPr>
+          <w:ilvl w:val="0"/>
+          <w:numId w:val="4"/>
+        </w:numPr>
+        <w:spacing w:before="0" w:beforeAutospacing="0" w:after="0" w:afterAutospacing="0"/>
+        <w:rPr>
+          <w:rFonts w:ascii="Calibri" w:hAnsi="Calibri" w:cs="Calibri"/>
+          <w:sz w:val="22"/>
+          <w:szCs w:val="22"/>
+        </w:rPr>
+      </w:pPr>
+      <w:r>
+        <w:rPr>
+          <w:rFonts w:ascii="Calibri" w:hAnsi="Calibri" w:cs="Calibri"/>
+          <w:sz w:val="22"/>
+          <w:szCs w:val="22"/>
+        </w:rPr>
+        <w:lastRenderedPageBreak/>
+        <w:t>The model performs significantly better than chance (p &lt; 0.05).</w:t>
+      </w:r>
+    </w:p>
+    <w:p>
+      <w:pPr>
+        <w:rPr>
+          <w:rFonts w:cs="Calibri"/>
+          <w:color w:val="000000"/>
+          <w:shd w:val="clear" w:color="auto" w:fill="FFFFFF"/>
+        </w:rPr>
+      </w:pPr>
+    </w:p>
+    <w:p>
+      <w:pPr>
+        <w:rPr>
+          <w:rFonts w:cs="Calibri"/>
+          <w:color w:val="000000"/>
+          <w:shd w:val="clear" w:color="auto" w:fill="FFFFFF"/>
+        </w:rPr>
+      </w:pPr>
+      <w:r>
+        <w:rPr>
+          <w:rFonts w:cs="Calibri"/>
+          <w:color w:val="000000"/>
+          <w:shd w:val="clear" w:color="auto" w:fill="FFFFFF"/>
+        </w:rPr>
+        <w:t xml:space="preserve">The model has a mean accuracy of 93.34%, and a standard deviation of </w:t>
+      </w:r>
+      <w:r>
+        <w:rPr>
+          <w:rFonts w:cs="Calibri"/>
+          <w:color w:val="000000"/>
+          <w:shd w:val="clear" w:color="auto" w:fill="FFFFFF"/>
+        </w:rPr>
+        <w:t xml:space="preserve">0.0007. </w:t>
+      </w:r>
+      <w:r>
+        <w:rPr>
+          <w:rFonts w:cs="Calibri"/>
+          <w:color w:val="000000"/>
+          <w:shd w:val="clear" w:color="auto" w:fill="FFFFFF"/>
+        </w:rPr>
+        <w:t xml:space="preserve">The small standard deviation shows that the model’s performance is consistent across the 12 different runs. The high accuracy is not a result of chance or luck but of the </w:t>
+      </w:r>
+      <w:r>
+        <w:rPr>
+          <w:rFonts w:cs="Calibri"/>
+          <w:color w:val="000000"/>
+          <w:shd w:val="clear" w:color="auto" w:fill="FFFFFF"/>
+        </w:rPr>
+        <w:t>model’s</w:t>
+      </w:r>
+      <w:r>
+        <w:rPr>
+          <w:rFonts w:cs="Calibri"/>
+          <w:color w:val="000000"/>
+          <w:shd w:val="clear" w:color="auto" w:fill="FFFFFF"/>
+        </w:rPr>
+        <w:t xml:space="preserve"> good feature selection.</w:t>
+      </w:r>
+    </w:p>
+    <w:p>
+      <w:pPr>
+        <w:rPr>
+          <w:rFonts w:cs="Calibri"/>
+          <w:color w:val="000000"/>
+          <w:shd w:val="clear" w:color="auto" w:fill="FFFFFF"/>
+        </w:rPr>
+      </w:pPr>
+      <w:r>
+        <w:rPr>
+          <w:rFonts w:cs="Calibri"/>
+          <w:color w:val="000000"/>
+          <w:shd w:val="clear" w:color="auto" w:fill="FFFFFF"/>
+        </w:rPr>
+        <w:t>The data set has 8 classes, and the chance level of accuracy is 1/8 or 0.125. So, a one-sample t-test was used using the 0.125 value.</w:t>
+      </w:r>
+      <w:r>
+        <w:rPr>
+          <w:rFonts w:cs="Calibri"/>
+          <w:color w:val="000000"/>
+          <w:shd w:val="clear" w:color="auto" w:fill="FFFFFF"/>
+        </w:rPr>
+        <w:t xml:space="preserve"> This gave a t-statistic of ~3600 and a p-value of 9.42x10</w:t>
+      </w:r>
+      <w:r>
+        <w:rPr>
+          <w:rFonts w:cs="Calibri"/>
+          <w:color w:val="000000"/>
+          <w:shd w:val="clear" w:color="auto" w:fill="FFFFFF"/>
+          <w:vertAlign w:val="superscript"/>
+        </w:rPr>
+        <w:t>-35</w:t>
+      </w:r>
+      <w:r>
+        <w:rPr>
+          <w:rFonts w:cs="Calibri"/>
+          <w:color w:val="000000"/>
+          <w:shd w:val="clear" w:color="auto" w:fill="FFFFFF"/>
+        </w:rPr>
+        <w:t>.</w:t>
+      </w:r>
+      <w:r>
+        <w:rPr>
+          <w:rFonts w:cs="Calibri"/>
+          <w:color w:val="000000"/>
+          <w:shd w:val="clear" w:color="auto" w:fill="FFFFFF"/>
+        </w:rPr>
+        <w:t xml:space="preserve"> </w:t>
+      </w:r>
+      <w:r>
+        <w:rPr>
+          <w:rFonts w:cs="Calibri"/>
+          <w:color w:val="000000"/>
+          <w:shd w:val="clear" w:color="auto" w:fill="FFFFFF"/>
+        </w:rPr>
+        <w:t xml:space="preserve">The incredibly high t-statistic and the very low p-value shows that the model </w:t>
+      </w:r>
+      <w:proofErr w:type="gramStart"/>
+      <w:r>
+        <w:rPr>
+          <w:rFonts w:cs="Calibri"/>
+          <w:color w:val="000000"/>
+          <w:shd w:val="clear" w:color="auto" w:fill="FFFFFF"/>
+        </w:rPr>
+        <w:t>definitely performs</w:t>
+      </w:r>
+      <w:proofErr w:type="gramEnd"/>
+      <w:r>
+        <w:rPr>
+          <w:rFonts w:cs="Calibri"/>
+          <w:color w:val="000000"/>
+          <w:shd w:val="clear" w:color="auto" w:fill="FFFFFF"/>
+        </w:rPr>
+        <w:t xml:space="preserve"> significantly better than chance. </w:t>
+      </w:r>
+      <w:r>
+        <w:rPr>
+          <w:rFonts w:cs="Calibri"/>
+          <w:color w:val="000000"/>
+          <w:shd w:val="clear" w:color="auto" w:fill="FFFFFF"/>
+        </w:rPr>
+        <w:t xml:space="preserve">The model </w:t>
+      </w:r>
+      <w:proofErr w:type="gramStart"/>
+      <w:r>
+        <w:rPr>
+          <w:rFonts w:cs="Calibri"/>
+          <w:color w:val="000000"/>
+          <w:shd w:val="clear" w:color="auto" w:fill="FFFFFF"/>
+        </w:rPr>
+        <w:t>is able to</w:t>
+      </w:r>
+      <w:proofErr w:type="gramEnd"/>
+      <w:r>
+        <w:rPr>
+          <w:rFonts w:cs="Calibri"/>
+          <w:color w:val="000000"/>
+          <w:shd w:val="clear" w:color="auto" w:fill="FFFFFF"/>
+        </w:rPr>
+        <w:t xml:space="preserve"> learn good patterns from the training data to distinguish between the 8 different classes.</w:t>
+      </w:r>
     </w:p>
     <w:p>
       <w:pPr>
@@ -4324,24 +4896,698 @@
           <w:shd w:val="clear" w:color="auto" w:fill="FFFFFF"/>
         </w:rPr>
       </w:pPr>
-    </w:p>
-    <w:p>
-      <w:pPr>
-        <w:rPr>
-          <w:rFonts w:cs="Calibri"/>
-          <w:color w:val="000000"/>
-          <w:shd w:val="clear" w:color="auto" w:fill="FFFFFF"/>
-        </w:rPr>
-      </w:pPr>
-    </w:p>
-    <w:p>
-      <w:pPr>
-        <w:rPr>
-          <w:rFonts w:cs="Calibri"/>
-          <w:color w:val="000000"/>
-          <w:shd w:val="clear" w:color="auto" w:fill="FFFFFF"/>
-        </w:rPr>
-      </w:pPr>
+      <w:r>
+        <w:rPr>
+          <w:rFonts w:cs="Calibri"/>
+          <w:color w:val="000000"/>
+          <w:shd w:val="clear" w:color="auto" w:fill="FFFFFF"/>
+        </w:rPr>
+        <w:t xml:space="preserve">Section 3.3 performs an evaluation of the best model’s performance on the test set. </w:t>
+      </w:r>
+      <w:r>
+        <w:rPr>
+          <w:rFonts w:cs="Calibri"/>
+          <w:color w:val="000000"/>
+          <w:shd w:val="clear" w:color="auto" w:fill="FFFFFF"/>
+        </w:rPr>
+        <w:t xml:space="preserve">The outcomes are as follows: </w:t>
+      </w:r>
+    </w:p>
+    <w:tbl>
+      <w:tblPr>
+        <w:tblStyle w:val="TableGrid"/>
+        <w:tblW w:w="0" w:type="auto"/>
+        <w:tblBorders>
+          <w:top w:val="none" w:sz="0" w:space="0" w:color="auto"/>
+          <w:left w:val="none" w:sz="0" w:space="0" w:color="auto"/>
+          <w:bottom w:val="none" w:sz="0" w:space="0" w:color="auto"/>
+          <w:right w:val="none" w:sz="0" w:space="0" w:color="auto"/>
+          <w:insideH w:val="none" w:sz="0" w:space="0" w:color="auto"/>
+          <w:insideV w:val="none" w:sz="0" w:space="0" w:color="auto"/>
+        </w:tblBorders>
+        <w:tblLook w:val="04A0" w:firstRow="1" w:lastRow="0" w:firstColumn="1" w:lastColumn="0" w:noHBand="0" w:noVBand="1"/>
+      </w:tblPr>
+      <w:tblGrid>
+        <w:gridCol w:w="3947"/>
+        <w:gridCol w:w="5805"/>
+      </w:tblGrid>
+      <w:tr>
+        <w:tc>
+          <w:tcPr>
+            <w:tcW w:w="4871" w:type="dxa"/>
+          </w:tcPr>
+          <w:p>
+            <w:pPr>
+              <w:pStyle w:val="ListParagraph"/>
+              <w:numPr>
+                <w:ilvl w:val="0"/>
+                <w:numId w:val="5"/>
+              </w:numPr>
+              <w:rPr>
+                <w:rFonts w:cs="Calibri"/>
+                <w:color w:val="000000"/>
+                <w:shd w:val="clear" w:color="auto" w:fill="FFFFFF"/>
+              </w:rPr>
+            </w:pPr>
+            <w:r>
+              <w:rPr>
+                <w:rFonts w:cs="Calibri"/>
+                <w:color w:val="000000"/>
+                <w:shd w:val="clear" w:color="auto" w:fill="FFFFFF"/>
+              </w:rPr>
+              <w:t>Ave Accuracy = 0.9450</w:t>
+            </w:r>
+          </w:p>
+          <w:p>
+            <w:pPr>
+              <w:pStyle w:val="ListParagraph"/>
+              <w:rPr>
+                <w:rFonts w:cs="Calibri"/>
+                <w:color w:val="000000"/>
+                <w:shd w:val="clear" w:color="auto" w:fill="FFFFFF"/>
+              </w:rPr>
+            </w:pPr>
+          </w:p>
+          <w:p>
+            <w:pPr>
+              <w:pStyle w:val="ListParagraph"/>
+              <w:numPr>
+                <w:ilvl w:val="0"/>
+                <w:numId w:val="5"/>
+              </w:numPr>
+              <w:rPr>
+                <w:rFonts w:cs="Calibri"/>
+                <w:color w:val="000000"/>
+                <w:shd w:val="clear" w:color="auto" w:fill="FFFFFF"/>
+              </w:rPr>
+            </w:pPr>
+            <w:r>
+              <w:rPr>
+                <w:rFonts w:cs="Calibri"/>
+                <w:color w:val="000000"/>
+                <w:shd w:val="clear" w:color="auto" w:fill="FFFFFF"/>
+              </w:rPr>
+              <w:t>Ave Precision = 0.95</w:t>
+            </w:r>
+          </w:p>
+          <w:p>
+            <w:pPr>
+              <w:pStyle w:val="ListParagraph"/>
+              <w:rPr>
+                <w:rFonts w:cs="Calibri"/>
+                <w:color w:val="000000"/>
+                <w:shd w:val="clear" w:color="auto" w:fill="FFFFFF"/>
+              </w:rPr>
+            </w:pPr>
+          </w:p>
+          <w:p>
+            <w:pPr>
+              <w:pStyle w:val="ListParagraph"/>
+              <w:numPr>
+                <w:ilvl w:val="0"/>
+                <w:numId w:val="5"/>
+              </w:numPr>
+              <w:rPr>
+                <w:rFonts w:cs="Calibri"/>
+                <w:color w:val="000000"/>
+                <w:shd w:val="clear" w:color="auto" w:fill="FFFFFF"/>
+              </w:rPr>
+            </w:pPr>
+            <w:r>
+              <w:rPr>
+                <w:rFonts w:cs="Calibri"/>
+                <w:color w:val="000000"/>
+                <w:shd w:val="clear" w:color="auto" w:fill="FFFFFF"/>
+              </w:rPr>
+              <w:t>Ave TPR = 0.95</w:t>
+            </w:r>
+          </w:p>
+          <w:p>
+            <w:pPr>
+              <w:pStyle w:val="ListParagraph"/>
+              <w:rPr>
+                <w:rFonts w:cs="Calibri"/>
+                <w:color w:val="000000"/>
+                <w:shd w:val="clear" w:color="auto" w:fill="FFFFFF"/>
+              </w:rPr>
+            </w:pPr>
+          </w:p>
+          <w:p>
+            <w:pPr>
+              <w:pStyle w:val="ListParagraph"/>
+              <w:numPr>
+                <w:ilvl w:val="0"/>
+                <w:numId w:val="5"/>
+              </w:numPr>
+              <w:rPr>
+                <w:rFonts w:cs="Calibri"/>
+                <w:color w:val="000000"/>
+                <w:shd w:val="clear" w:color="auto" w:fill="FFFFFF"/>
+              </w:rPr>
+            </w:pPr>
+            <w:r>
+              <w:rPr>
+                <w:rFonts w:cs="Calibri"/>
+                <w:color w:val="000000"/>
+                <w:shd w:val="clear" w:color="auto" w:fill="FFFFFF"/>
+              </w:rPr>
+              <w:t>Ave F1-score = 0.95</w:t>
+            </w:r>
+          </w:p>
+          <w:p>
+            <w:pPr>
+              <w:pStyle w:val="ListParagraph"/>
+              <w:rPr>
+                <w:rFonts w:cs="Calibri"/>
+                <w:color w:val="000000"/>
+                <w:shd w:val="clear" w:color="auto" w:fill="FFFFFF"/>
+              </w:rPr>
+            </w:pPr>
+          </w:p>
+          <w:p>
+            <w:pPr>
+              <w:pStyle w:val="ListParagraph"/>
+              <w:numPr>
+                <w:ilvl w:val="0"/>
+                <w:numId w:val="5"/>
+              </w:numPr>
+              <w:rPr>
+                <w:rFonts w:cs="Calibri"/>
+                <w:color w:val="000000"/>
+                <w:shd w:val="clear" w:color="auto" w:fill="FFFFFF"/>
+              </w:rPr>
+            </w:pPr>
+            <w:r>
+              <w:rPr>
+                <w:rFonts w:cs="Calibri"/>
+                <w:color w:val="000000"/>
+                <w:shd w:val="clear" w:color="auto" w:fill="FFFFFF"/>
+              </w:rPr>
+              <w:t>Ave FPR = 0.00786</w:t>
+            </w:r>
+          </w:p>
+          <w:p>
+            <w:pPr>
+              <w:rPr>
+                <w:rFonts w:cs="Calibri"/>
+                <w:color w:val="000000"/>
+                <w:shd w:val="clear" w:color="auto" w:fill="FFFFFF"/>
+              </w:rPr>
+            </w:pPr>
+          </w:p>
+        </w:tc>
+        <w:tc>
+          <w:tcPr>
+            <w:tcW w:w="4871" w:type="dxa"/>
+          </w:tcPr>
+          <w:p>
+            <w:pPr>
+              <w:rPr>
+                <w:rFonts w:cs="Calibri"/>
+                <w:color w:val="000000"/>
+                <w:shd w:val="clear" w:color="auto" w:fill="FFFFFF"/>
+              </w:rPr>
+            </w:pPr>
+            <w:r>
+              <w:rPr>
+                <w:rFonts w:cs="Calibri"/>
+                <w:noProof/>
+                <w:color w:val="000000"/>
+                <w:shd w:val="clear" w:color="auto" w:fill="FFFFFF"/>
+              </w:rPr>
+              <w:drawing>
+                <wp:inline distT="0" distB="0" distL="0" distR="0" wp14:anchorId="7EB6C25E" wp14:editId="69CB9CB9">
+                  <wp:extent cx="3549600" cy="1875736"/>
+                  <wp:effectExtent l="0" t="0" r="0" b="4445"/>
+                  <wp:docPr id="781504809" name="Picture 1"/>
+                  <wp:cNvGraphicFramePr>
+                    <a:graphicFrameLocks xmlns:a="http://schemas.openxmlformats.org/drawingml/2006/main" noChangeAspect="1"/>
+                  </wp:cNvGraphicFramePr>
+                  <a:graphic xmlns:a="http://schemas.openxmlformats.org/drawingml/2006/main">
+                    <a:graphicData uri="http://schemas.openxmlformats.org/drawingml/2006/picture">
+                      <pic:pic xmlns:pic="http://schemas.openxmlformats.org/drawingml/2006/picture">
+                        <pic:nvPicPr>
+                          <pic:cNvPr id="781504809" name=""/>
+                          <pic:cNvPicPr/>
+                        </pic:nvPicPr>
+                        <pic:blipFill>
+                          <a:blip r:embed="rId19"/>
+                          <a:stretch>
+                            <a:fillRect/>
+                          </a:stretch>
+                        </pic:blipFill>
+                        <pic:spPr>
+                          <a:xfrm>
+                            <a:off x="0" y="0"/>
+                            <a:ext cx="3601944" cy="1903397"/>
+                          </a:xfrm>
+                          <a:prstGeom prst="rect">
+                            <a:avLst/>
+                          </a:prstGeom>
+                        </pic:spPr>
+                      </pic:pic>
+                    </a:graphicData>
+                  </a:graphic>
+                </wp:inline>
+              </w:drawing>
+            </w:r>
+          </w:p>
+          <w:p>
+            <w:pPr>
+              <w:jc w:val="center"/>
+              <w:rPr>
+                <w:rFonts w:cs="Calibri"/>
+                <w:b/>
+                <w:bCs/>
+                <w:color w:val="000000"/>
+                <w:sz w:val="16"/>
+                <w:szCs w:val="16"/>
+                <w:shd w:val="clear" w:color="auto" w:fill="FFFFFF"/>
+              </w:rPr>
+            </w:pPr>
+            <w:r>
+              <w:rPr>
+                <w:rFonts w:cs="Calibri"/>
+                <w:b/>
+                <w:bCs/>
+                <w:color w:val="000000"/>
+                <w:sz w:val="16"/>
+                <w:szCs w:val="16"/>
+                <w:shd w:val="clear" w:color="auto" w:fill="FFFFFF"/>
+              </w:rPr>
+              <w:t>Figure 9 – classification report for best random forest model</w:t>
+            </w:r>
+          </w:p>
+        </w:tc>
+      </w:tr>
+    </w:tbl>
+    <w:p>
+      <w:pPr>
+        <w:rPr>
+          <w:rFonts w:cs="Calibri"/>
+          <w:color w:val="000000"/>
+          <w:shd w:val="clear" w:color="auto" w:fill="FFFFFF"/>
+        </w:rPr>
+      </w:pPr>
+    </w:p>
+    <w:p>
+      <w:pPr>
+        <w:rPr>
+          <w:rFonts w:cs="Calibri"/>
+          <w:color w:val="000000"/>
+          <w:shd w:val="clear" w:color="auto" w:fill="FFFFFF"/>
+        </w:rPr>
+      </w:pPr>
+      <w:r>
+        <w:rPr>
+          <w:rFonts w:cs="Calibri"/>
+          <w:color w:val="000000"/>
+          <w:shd w:val="clear" w:color="auto" w:fill="FFFFFF"/>
+        </w:rPr>
+        <w:t xml:space="preserve">Confusion Matrix: </w:t>
+      </w:r>
+    </w:p>
+    <w:tbl>
+      <w:tblPr>
+        <w:tblStyle w:val="TableGrid"/>
+        <w:tblW w:w="0" w:type="auto"/>
+        <w:tblBorders>
+          <w:top w:val="none" w:sz="0" w:space="0" w:color="auto"/>
+          <w:left w:val="none" w:sz="0" w:space="0" w:color="auto"/>
+          <w:bottom w:val="none" w:sz="0" w:space="0" w:color="auto"/>
+          <w:right w:val="none" w:sz="0" w:space="0" w:color="auto"/>
+          <w:insideH w:val="none" w:sz="0" w:space="0" w:color="auto"/>
+          <w:insideV w:val="none" w:sz="0" w:space="0" w:color="auto"/>
+        </w:tblBorders>
+        <w:tblLook w:val="04A0" w:firstRow="1" w:lastRow="0" w:firstColumn="1" w:lastColumn="0" w:noHBand="0" w:noVBand="1"/>
+      </w:tblPr>
+      <w:tblGrid>
+        <w:gridCol w:w="4871"/>
+        <w:gridCol w:w="4871"/>
+      </w:tblGrid>
+      <w:tr>
+        <w:tc>
+          <w:tcPr>
+            <w:tcW w:w="4871" w:type="dxa"/>
+          </w:tcPr>
+          <w:p>
+            <w:pPr>
+              <w:rPr>
+                <w:rFonts w:cs="Calibri"/>
+                <w:color w:val="000000"/>
+                <w:shd w:val="clear" w:color="auto" w:fill="FFFFFF"/>
+              </w:rPr>
+            </w:pPr>
+            <w:r>
+              <w:rPr>
+                <w:rFonts w:cs="Calibri"/>
+                <w:noProof/>
+                <w:color w:val="000000"/>
+                <w:shd w:val="clear" w:color="auto" w:fill="FFFFFF"/>
+              </w:rPr>
+              <w:drawing>
+                <wp:inline distT="0" distB="0" distL="0" distR="0" wp14:anchorId="3CEE15B5" wp14:editId="5F34DD0B">
+                  <wp:extent cx="2879852" cy="2304000"/>
+                  <wp:effectExtent l="0" t="0" r="3175" b="0"/>
+                  <wp:docPr id="1316661320" name="Picture 9"/>
+                  <wp:cNvGraphicFramePr>
+                    <a:graphicFrameLocks xmlns:a="http://schemas.openxmlformats.org/drawingml/2006/main" noChangeAspect="1"/>
+                  </wp:cNvGraphicFramePr>
+                  <a:graphic xmlns:a="http://schemas.openxmlformats.org/drawingml/2006/main">
+                    <a:graphicData uri="http://schemas.openxmlformats.org/drawingml/2006/picture">
+                      <pic:pic xmlns:pic="http://schemas.openxmlformats.org/drawingml/2006/picture">
+                        <pic:nvPicPr>
+                          <pic:cNvPr id="1316661320" name="Picture 1316661320"/>
+                          <pic:cNvPicPr/>
+                        </pic:nvPicPr>
+                        <pic:blipFill>
+                          <a:blip r:embed="rId20" cstate="print">
+                            <a:extLst>
+                              <a:ext uri="{28A0092B-C50C-407E-A947-70E740481C1C}">
+                                <a14:useLocalDpi xmlns:a14="http://schemas.microsoft.com/office/drawing/2010/main" val="0"/>
+                              </a:ext>
+                            </a:extLst>
+                          </a:blip>
+                          <a:stretch>
+                            <a:fillRect/>
+                          </a:stretch>
+                        </pic:blipFill>
+                        <pic:spPr>
+                          <a:xfrm>
+                            <a:off x="0" y="0"/>
+                            <a:ext cx="2926562" cy="2341370"/>
+                          </a:xfrm>
+                          <a:prstGeom prst="rect">
+                            <a:avLst/>
+                          </a:prstGeom>
+                        </pic:spPr>
+                      </pic:pic>
+                    </a:graphicData>
+                  </a:graphic>
+                </wp:inline>
+              </w:drawing>
+            </w:r>
+          </w:p>
+          <w:p>
+            <w:pPr>
+              <w:jc w:val="center"/>
+              <w:rPr>
+                <w:rFonts w:cs="Calibri"/>
+                <w:b/>
+                <w:bCs/>
+                <w:color w:val="000000"/>
+                <w:sz w:val="16"/>
+                <w:szCs w:val="16"/>
+                <w:shd w:val="clear" w:color="auto" w:fill="FFFFFF"/>
+              </w:rPr>
+            </w:pPr>
+            <w:r>
+              <w:rPr>
+                <w:rFonts w:cs="Calibri"/>
+                <w:b/>
+                <w:bCs/>
+                <w:color w:val="000000"/>
+                <w:sz w:val="16"/>
+                <w:szCs w:val="16"/>
+                <w:shd w:val="clear" w:color="auto" w:fill="FFFFFF"/>
+              </w:rPr>
+              <w:t xml:space="preserve">Figure </w:t>
+            </w:r>
+            <w:r>
+              <w:rPr>
+                <w:rFonts w:cs="Calibri"/>
+                <w:b/>
+                <w:bCs/>
+                <w:color w:val="000000"/>
+                <w:sz w:val="16"/>
+                <w:szCs w:val="16"/>
+                <w:shd w:val="clear" w:color="auto" w:fill="FFFFFF"/>
+              </w:rPr>
+              <w:t>10</w:t>
+            </w:r>
+            <w:r>
+              <w:rPr>
+                <w:rFonts w:cs="Calibri"/>
+                <w:b/>
+                <w:bCs/>
+                <w:color w:val="000000"/>
+                <w:sz w:val="16"/>
+                <w:szCs w:val="16"/>
+                <w:shd w:val="clear" w:color="auto" w:fill="FFFFFF"/>
+              </w:rPr>
+              <w:t xml:space="preserve"> – CM for best random forest model</w:t>
+            </w:r>
+          </w:p>
+        </w:tc>
+        <w:tc>
+          <w:tcPr>
+            <w:tcW w:w="4871" w:type="dxa"/>
+          </w:tcPr>
+          <w:p>
+            <w:pPr>
+              <w:rPr>
+                <w:rFonts w:cs="Calibri"/>
+                <w:color w:val="000000"/>
+                <w:shd w:val="clear" w:color="auto" w:fill="FFFFFF"/>
+              </w:rPr>
+            </w:pPr>
+          </w:p>
+          <w:p>
+            <w:pPr>
+              <w:rPr>
+                <w:rFonts w:cs="Calibri"/>
+                <w:color w:val="000000"/>
+                <w:shd w:val="clear" w:color="auto" w:fill="FFFFFF"/>
+              </w:rPr>
+            </w:pPr>
+            <w:r>
+              <w:rPr>
+                <w:rFonts w:cs="Calibri"/>
+                <w:color w:val="000000"/>
+                <w:shd w:val="clear" w:color="auto" w:fill="FFFFFF"/>
+              </w:rPr>
+              <w:t xml:space="preserve">The confusion matrix shows that </w:t>
+            </w:r>
+            <w:proofErr w:type="gramStart"/>
+            <w:r>
+              <w:rPr>
+                <w:rFonts w:cs="Calibri"/>
+                <w:color w:val="000000"/>
+                <w:shd w:val="clear" w:color="auto" w:fill="FFFFFF"/>
+              </w:rPr>
+              <w:t>the majority of</w:t>
+            </w:r>
+            <w:proofErr w:type="gramEnd"/>
+            <w:r>
+              <w:rPr>
+                <w:rFonts w:cs="Calibri"/>
+                <w:color w:val="000000"/>
+                <w:shd w:val="clear" w:color="auto" w:fill="FFFFFF"/>
+              </w:rPr>
+              <w:t xml:space="preserve"> images </w:t>
+            </w:r>
+            <w:r>
+              <w:rPr>
+                <w:rFonts w:cs="Calibri"/>
+                <w:color w:val="000000"/>
+                <w:shd w:val="clear" w:color="auto" w:fill="FFFFFF"/>
+              </w:rPr>
+              <w:t>were</w:t>
+            </w:r>
+            <w:r>
+              <w:rPr>
+                <w:rFonts w:cs="Calibri"/>
+                <w:color w:val="000000"/>
+                <w:shd w:val="clear" w:color="auto" w:fill="FFFFFF"/>
+              </w:rPr>
+              <w:t xml:space="preserve"> classified correctly, showing that the model performed well on unseen data. </w:t>
+            </w:r>
+            <w:r>
+              <w:rPr>
+                <w:rFonts w:cs="Calibri"/>
+                <w:color w:val="000000"/>
+                <w:shd w:val="clear" w:color="auto" w:fill="FFFFFF"/>
+              </w:rPr>
+              <w:t>All envelopes and pencils were classified correctly, with most of the other classes only having a few mis-</w:t>
+            </w:r>
+            <w:r>
+              <w:rPr>
+                <w:rFonts w:cs="Calibri"/>
+                <w:color w:val="000000"/>
+                <w:shd w:val="clear" w:color="auto" w:fill="FFFFFF"/>
+              </w:rPr>
+              <w:t>classified</w:t>
+            </w:r>
+            <w:r>
+              <w:rPr>
+                <w:rFonts w:cs="Calibri"/>
+                <w:color w:val="000000"/>
+                <w:shd w:val="clear" w:color="auto" w:fill="FFFFFF"/>
+              </w:rPr>
+              <w:t xml:space="preserve"> objects. </w:t>
+            </w:r>
+            <w:r>
+              <w:rPr>
+                <w:rFonts w:cs="Calibri"/>
+                <w:color w:val="000000"/>
+                <w:shd w:val="clear" w:color="auto" w:fill="FFFFFF"/>
+              </w:rPr>
+              <w:t>The class that appeared to be the hardest to classify was the cherry class, with 7 out of 50 objects being mis-classified.</w:t>
+            </w:r>
+            <w:r>
+              <w:rPr>
+                <w:rFonts w:cs="Calibri"/>
+                <w:color w:val="000000"/>
+                <w:shd w:val="clear" w:color="auto" w:fill="FFFFFF"/>
+              </w:rPr>
+              <w:t xml:space="preserve"> The cherry class has a TPR value of 86% (see table above), which, while lower than the rest of the classes, is still a high number relatively speaking.</w:t>
+            </w:r>
+          </w:p>
+        </w:tc>
+      </w:tr>
+    </w:tbl>
+    <w:p>
+      <w:pPr>
+        <w:rPr>
+          <w:rFonts w:cs="Calibri"/>
+          <w:color w:val="000000"/>
+          <w:shd w:val="clear" w:color="auto" w:fill="FFFFFF"/>
+        </w:rPr>
+      </w:pPr>
+    </w:p>
+    <w:p>
+      <w:pPr>
+        <w:rPr>
+          <w:rFonts w:cs="Calibri"/>
+          <w:color w:val="000000"/>
+          <w:shd w:val="clear" w:color="auto" w:fill="FFFFFF"/>
+        </w:rPr>
+      </w:pPr>
+      <w:r>
+        <w:rPr>
+          <w:rFonts w:cs="Calibri"/>
+          <w:color w:val="000000"/>
+          <w:shd w:val="clear" w:color="auto" w:fill="FFFFFF"/>
+        </w:rPr>
+        <w:t xml:space="preserve">The accuracy for the test data is 94.5%. The accuracy from task 3.1 for the training data is 93.38%. </w:t>
+      </w:r>
+      <w:r>
+        <w:rPr>
+          <w:rFonts w:cs="Calibri"/>
+          <w:color w:val="000000"/>
+          <w:shd w:val="clear" w:color="auto" w:fill="FFFFFF"/>
+        </w:rPr>
+        <w:t>This shows that the model works very well on unseen data and actually ended up having a higher accuracy for the test data than the training data.</w:t>
+      </w:r>
+    </w:p>
+    <w:p>
+      <w:pPr>
+        <w:rPr>
+          <w:rFonts w:cs="Calibri"/>
+          <w:color w:val="000000"/>
+          <w:shd w:val="clear" w:color="auto" w:fill="FFFFFF"/>
+        </w:rPr>
+      </w:pPr>
+      <w:r>
+        <w:rPr>
+          <w:rFonts w:cs="Calibri"/>
+          <w:color w:val="000000"/>
+          <w:shd w:val="clear" w:color="auto" w:fill="FFFFFF"/>
+        </w:rPr>
+        <w:lastRenderedPageBreak/>
+        <w:t xml:space="preserve">The </w:t>
+      </w:r>
+      <w:r>
+        <w:rPr>
+          <w:rFonts w:cs="Calibri"/>
+          <w:color w:val="000000"/>
+          <w:shd w:val="clear" w:color="auto" w:fill="FFFFFF"/>
+        </w:rPr>
+        <w:t xml:space="preserve">average </w:t>
+      </w:r>
+      <w:r>
+        <w:rPr>
+          <w:rFonts w:cs="Calibri"/>
+          <w:color w:val="000000"/>
+          <w:shd w:val="clear" w:color="auto" w:fill="FFFFFF"/>
+        </w:rPr>
+        <w:t xml:space="preserve">precision </w:t>
+      </w:r>
+      <w:r>
+        <w:rPr>
+          <w:rFonts w:cs="Calibri"/>
+          <w:color w:val="000000"/>
+          <w:shd w:val="clear" w:color="auto" w:fill="FFFFFF"/>
+        </w:rPr>
+        <w:t xml:space="preserve">value is 95%, meaning that of all the times the model predicted a class, it was right 95% of the time. This means that the model is very reliable, when it predicts a </w:t>
+      </w:r>
+      <w:r>
+        <w:rPr>
+          <w:rFonts w:cs="Calibri"/>
+          <w:color w:val="000000"/>
+          <w:shd w:val="clear" w:color="auto" w:fill="FFFFFF"/>
+        </w:rPr>
+        <w:t>label</w:t>
+      </w:r>
+      <w:r>
+        <w:rPr>
+          <w:rFonts w:cs="Calibri"/>
+          <w:color w:val="000000"/>
+          <w:shd w:val="clear" w:color="auto" w:fill="FFFFFF"/>
+        </w:rPr>
+        <w:t xml:space="preserve"> is it usually right.</w:t>
+      </w:r>
+    </w:p>
+    <w:p>
+      <w:pPr>
+        <w:rPr>
+          <w:rFonts w:cs="Calibri"/>
+          <w:color w:val="000000"/>
+          <w:shd w:val="clear" w:color="auto" w:fill="FFFFFF"/>
+        </w:rPr>
+      </w:pPr>
+      <w:r>
+        <w:rPr>
+          <w:rFonts w:cs="Calibri"/>
+          <w:color w:val="000000"/>
+          <w:shd w:val="clear" w:color="auto" w:fill="FFFFFF"/>
+        </w:rPr>
+        <w:t>The average TPR (true positive rate) is 95%. The model is very thorough and rarely misses an object, again showing how strong and reliable the model is.</w:t>
+      </w:r>
+    </w:p>
+    <w:p>
+      <w:pPr>
+        <w:rPr>
+          <w:rFonts w:cs="Calibri"/>
+          <w:color w:val="000000"/>
+          <w:shd w:val="clear" w:color="auto" w:fill="FFFFFF"/>
+        </w:rPr>
+      </w:pPr>
+      <w:r>
+        <w:rPr>
+          <w:rFonts w:cs="Calibri"/>
+          <w:color w:val="000000"/>
+          <w:shd w:val="clear" w:color="auto" w:fill="FFFFFF"/>
+        </w:rPr>
+        <w:t>The high F1 score, again 95%, shows that the model is well balanced and it is quite accurate in its guesses and in finding the objects.</w:t>
+      </w:r>
+    </w:p>
+    <w:p>
+      <w:pPr>
+        <w:rPr>
+          <w:rFonts w:cs="Calibri"/>
+          <w:color w:val="000000"/>
+          <w:shd w:val="clear" w:color="auto" w:fill="FFFFFF"/>
+        </w:rPr>
+      </w:pPr>
+      <w:r>
+        <w:rPr>
+          <w:rFonts w:cs="Calibri"/>
+          <w:color w:val="000000"/>
+          <w:shd w:val="clear" w:color="auto" w:fill="FFFFFF"/>
+        </w:rPr>
+        <w:t xml:space="preserve">The model had a very low FPR (false positive rate), showing again that it is a strong and reliable model. </w:t>
+      </w:r>
     </w:p>
     <w:p>
       <w:pPr>
@@ -4355,7 +5601,6 @@
         <w:rPr>
           <w:shd w:val="clear" w:color="auto" w:fill="FFFFFF"/>
         </w:rPr>
-        <w:lastRenderedPageBreak/>
         <w:t>Conclusions</w:t>
       </w:r>
     </w:p>
@@ -4368,6 +5613,22 @@
           <w:shd w:val="clear" w:color="auto" w:fill="FFFFFF"/>
         </w:rPr>
       </w:pPr>
+      <w:r>
+        <w:rPr>
+          <w:rFonts w:cs="Calibri"/>
+          <w:color w:val="000000"/>
+          <w:shd w:val="clear" w:color="auto" w:fill="FFFFFF"/>
+        </w:rPr>
+        <w:t xml:space="preserve">In conclusion, the classifiers and models used throughout this assignment were very helpful in understanding and getting an overall better grasp of Machine Learning. </w:t>
+      </w:r>
+      <w:r>
+        <w:rPr>
+          <w:rFonts w:cs="Calibri"/>
+          <w:color w:val="000000"/>
+          <w:shd w:val="clear" w:color="auto" w:fill="FFFFFF"/>
+        </w:rPr>
+        <w:t xml:space="preserve">The visualisation of many of the model’s outputs were especially useful for understanding how the model actually worked. </w:t>
+      </w:r>
     </w:p>
     <w:p>
       <w:pPr>
@@ -4413,7 +5674,7 @@
       <w:r>
         <w:t xml:space="preserve"> </w:t>
       </w:r>
-      <w:hyperlink r:id="rId19" w:history="1">
+      <w:hyperlink r:id="rId21" w:history="1">
         <w:r>
           <w:rPr>
             <w:rStyle w:val="Hyperlink"/>
@@ -4443,7 +5704,7 @@
       <w:r>
         <w:t xml:space="preserve"> </w:t>
       </w:r>
-      <w:hyperlink r:id="rId20" w:history="1">
+      <w:hyperlink r:id="rId22" w:history="1">
         <w:r>
           <w:rPr>
             <w:rStyle w:val="Hyperlink"/>
@@ -4468,16 +5729,16 @@
           <w:color w:val="000000"/>
           <w:shd w:val="clear" w:color="auto" w:fill="FFFFFF"/>
         </w:rPr>
-        <w:t xml:space="preserve">[x] could be a useful link for predictions with decision trees and Knn stuff: </w:t>
-      </w:r>
-      <w:hyperlink r:id="rId21" w:history="1">
+        <w:t xml:space="preserve">[3]. </w:t>
+      </w:r>
+      <w:hyperlink r:id="rId23" w:history="1">
         <w:r>
           <w:rPr>
             <w:rStyle w:val="Hyperlink"/>
             <w:rFonts w:cs="Calibri"/>
             <w:shd w:val="clear" w:color="auto" w:fill="FFFFFF"/>
           </w:rPr>
-          <w:t>https://www.askpython.com/python/examples/python-predict-function</w:t>
+          <w:t>https://www.geeksforgeeks.org/machine-learning/random-forest-algorithm-in-machine-learning/</w:t>
         </w:r>
       </w:hyperlink>
     </w:p>
@@ -4501,8 +5762,8 @@
     </w:p>
     <w:p/>
     <w:sectPr>
-      <w:headerReference w:type="default" r:id="rId22"/>
-      <w:footerReference w:type="default" r:id="rId23"/>
+      <w:headerReference w:type="default" r:id="rId24"/>
+      <w:footerReference w:type="default" r:id="rId25"/>
       <w:pgSz w:w="11906" w:h="16838"/>
       <w:pgMar w:top="1281" w:right="1077" w:bottom="851" w:left="1077" w:header="425" w:footer="147" w:gutter="0"/>
       <w:cols w:space="708"/>
@@ -5202,6 +6463,232 @@
       </w:rPr>
     </w:lvl>
   </w:abstractNum>
+  <w:abstractNum w:abstractNumId="3" w15:restartNumberingAfterBreak="0">
+    <w:nsid w:val="5B9124F6"/>
+    <w:multiLevelType w:val="hybridMultilevel"/>
+    <w:tmpl w:val="657226FE"/>
+    <w:lvl w:ilvl="0" w:tplc="08090001">
+      <w:start w:val="1"/>
+      <w:numFmt w:val="bullet"/>
+      <w:lvlText w:val=""/>
+      <w:lvlJc w:val="left"/>
+      <w:pPr>
+        <w:ind w:left="765" w:hanging="360"/>
+      </w:pPr>
+      <w:rPr>
+        <w:rFonts w:ascii="Symbol" w:hAnsi="Symbol" w:hint="default"/>
+      </w:rPr>
+    </w:lvl>
+    <w:lvl w:ilvl="1" w:tplc="08090003" w:tentative="1">
+      <w:start w:val="1"/>
+      <w:numFmt w:val="bullet"/>
+      <w:lvlText w:val="o"/>
+      <w:lvlJc w:val="left"/>
+      <w:pPr>
+        <w:ind w:left="1485" w:hanging="360"/>
+      </w:pPr>
+      <w:rPr>
+        <w:rFonts w:ascii="Courier New" w:hAnsi="Courier New" w:cs="Courier New" w:hint="default"/>
+      </w:rPr>
+    </w:lvl>
+    <w:lvl w:ilvl="2" w:tplc="08090005" w:tentative="1">
+      <w:start w:val="1"/>
+      <w:numFmt w:val="bullet"/>
+      <w:lvlText w:val=""/>
+      <w:lvlJc w:val="left"/>
+      <w:pPr>
+        <w:ind w:left="2205" w:hanging="360"/>
+      </w:pPr>
+      <w:rPr>
+        <w:rFonts w:ascii="Wingdings" w:hAnsi="Wingdings" w:hint="default"/>
+      </w:rPr>
+    </w:lvl>
+    <w:lvl w:ilvl="3" w:tplc="08090001" w:tentative="1">
+      <w:start w:val="1"/>
+      <w:numFmt w:val="bullet"/>
+      <w:lvlText w:val=""/>
+      <w:lvlJc w:val="left"/>
+      <w:pPr>
+        <w:ind w:left="2925" w:hanging="360"/>
+      </w:pPr>
+      <w:rPr>
+        <w:rFonts w:ascii="Symbol" w:hAnsi="Symbol" w:hint="default"/>
+      </w:rPr>
+    </w:lvl>
+    <w:lvl w:ilvl="4" w:tplc="08090003" w:tentative="1">
+      <w:start w:val="1"/>
+      <w:numFmt w:val="bullet"/>
+      <w:lvlText w:val="o"/>
+      <w:lvlJc w:val="left"/>
+      <w:pPr>
+        <w:ind w:left="3645" w:hanging="360"/>
+      </w:pPr>
+      <w:rPr>
+        <w:rFonts w:ascii="Courier New" w:hAnsi="Courier New" w:cs="Courier New" w:hint="default"/>
+      </w:rPr>
+    </w:lvl>
+    <w:lvl w:ilvl="5" w:tplc="08090005" w:tentative="1">
+      <w:start w:val="1"/>
+      <w:numFmt w:val="bullet"/>
+      <w:lvlText w:val=""/>
+      <w:lvlJc w:val="left"/>
+      <w:pPr>
+        <w:ind w:left="4365" w:hanging="360"/>
+      </w:pPr>
+      <w:rPr>
+        <w:rFonts w:ascii="Wingdings" w:hAnsi="Wingdings" w:hint="default"/>
+      </w:rPr>
+    </w:lvl>
+    <w:lvl w:ilvl="6" w:tplc="08090001" w:tentative="1">
+      <w:start w:val="1"/>
+      <w:numFmt w:val="bullet"/>
+      <w:lvlText w:val=""/>
+      <w:lvlJc w:val="left"/>
+      <w:pPr>
+        <w:ind w:left="5085" w:hanging="360"/>
+      </w:pPr>
+      <w:rPr>
+        <w:rFonts w:ascii="Symbol" w:hAnsi="Symbol" w:hint="default"/>
+      </w:rPr>
+    </w:lvl>
+    <w:lvl w:ilvl="7" w:tplc="08090003" w:tentative="1">
+      <w:start w:val="1"/>
+      <w:numFmt w:val="bullet"/>
+      <w:lvlText w:val="o"/>
+      <w:lvlJc w:val="left"/>
+      <w:pPr>
+        <w:ind w:left="5805" w:hanging="360"/>
+      </w:pPr>
+      <w:rPr>
+        <w:rFonts w:ascii="Courier New" w:hAnsi="Courier New" w:cs="Courier New" w:hint="default"/>
+      </w:rPr>
+    </w:lvl>
+    <w:lvl w:ilvl="8" w:tplc="08090005" w:tentative="1">
+      <w:start w:val="1"/>
+      <w:numFmt w:val="bullet"/>
+      <w:lvlText w:val=""/>
+      <w:lvlJc w:val="left"/>
+      <w:pPr>
+        <w:ind w:left="6525" w:hanging="360"/>
+      </w:pPr>
+      <w:rPr>
+        <w:rFonts w:ascii="Wingdings" w:hAnsi="Wingdings" w:hint="default"/>
+      </w:rPr>
+    </w:lvl>
+  </w:abstractNum>
+  <w:abstractNum w:abstractNumId="4" w15:restartNumberingAfterBreak="0">
+    <w:nsid w:val="76130A02"/>
+    <w:multiLevelType w:val="hybridMultilevel"/>
+    <w:tmpl w:val="1DE06B30"/>
+    <w:lvl w:ilvl="0" w:tplc="08090001">
+      <w:start w:val="1"/>
+      <w:numFmt w:val="bullet"/>
+      <w:lvlText w:val=""/>
+      <w:lvlJc w:val="left"/>
+      <w:pPr>
+        <w:ind w:left="720" w:hanging="360"/>
+      </w:pPr>
+      <w:rPr>
+        <w:rFonts w:ascii="Symbol" w:hAnsi="Symbol" w:hint="default"/>
+      </w:rPr>
+    </w:lvl>
+    <w:lvl w:ilvl="1" w:tplc="08090003" w:tentative="1">
+      <w:start w:val="1"/>
+      <w:numFmt w:val="bullet"/>
+      <w:lvlText w:val="o"/>
+      <w:lvlJc w:val="left"/>
+      <w:pPr>
+        <w:ind w:left="1440" w:hanging="360"/>
+      </w:pPr>
+      <w:rPr>
+        <w:rFonts w:ascii="Courier New" w:hAnsi="Courier New" w:cs="Courier New" w:hint="default"/>
+      </w:rPr>
+    </w:lvl>
+    <w:lvl w:ilvl="2" w:tplc="08090005" w:tentative="1">
+      <w:start w:val="1"/>
+      <w:numFmt w:val="bullet"/>
+      <w:lvlText w:val=""/>
+      <w:lvlJc w:val="left"/>
+      <w:pPr>
+        <w:ind w:left="2160" w:hanging="360"/>
+      </w:pPr>
+      <w:rPr>
+        <w:rFonts w:ascii="Wingdings" w:hAnsi="Wingdings" w:hint="default"/>
+      </w:rPr>
+    </w:lvl>
+    <w:lvl w:ilvl="3" w:tplc="08090001" w:tentative="1">
+      <w:start w:val="1"/>
+      <w:numFmt w:val="bullet"/>
+      <w:lvlText w:val=""/>
+      <w:lvlJc w:val="left"/>
+      <w:pPr>
+        <w:ind w:left="2880" w:hanging="360"/>
+      </w:pPr>
+      <w:rPr>
+        <w:rFonts w:ascii="Symbol" w:hAnsi="Symbol" w:hint="default"/>
+      </w:rPr>
+    </w:lvl>
+    <w:lvl w:ilvl="4" w:tplc="08090003" w:tentative="1">
+      <w:start w:val="1"/>
+      <w:numFmt w:val="bullet"/>
+      <w:lvlText w:val="o"/>
+      <w:lvlJc w:val="left"/>
+      <w:pPr>
+        <w:ind w:left="3600" w:hanging="360"/>
+      </w:pPr>
+      <w:rPr>
+        <w:rFonts w:ascii="Courier New" w:hAnsi="Courier New" w:cs="Courier New" w:hint="default"/>
+      </w:rPr>
+    </w:lvl>
+    <w:lvl w:ilvl="5" w:tplc="08090005" w:tentative="1">
+      <w:start w:val="1"/>
+      <w:numFmt w:val="bullet"/>
+      <w:lvlText w:val=""/>
+      <w:lvlJc w:val="left"/>
+      <w:pPr>
+        <w:ind w:left="4320" w:hanging="360"/>
+      </w:pPr>
+      <w:rPr>
+        <w:rFonts w:ascii="Wingdings" w:hAnsi="Wingdings" w:hint="default"/>
+      </w:rPr>
+    </w:lvl>
+    <w:lvl w:ilvl="6" w:tplc="08090001" w:tentative="1">
+      <w:start w:val="1"/>
+      <w:numFmt w:val="bullet"/>
+      <w:lvlText w:val=""/>
+      <w:lvlJc w:val="left"/>
+      <w:pPr>
+        <w:ind w:left="5040" w:hanging="360"/>
+      </w:pPr>
+      <w:rPr>
+        <w:rFonts w:ascii="Symbol" w:hAnsi="Symbol" w:hint="default"/>
+      </w:rPr>
+    </w:lvl>
+    <w:lvl w:ilvl="7" w:tplc="08090003" w:tentative="1">
+      <w:start w:val="1"/>
+      <w:numFmt w:val="bullet"/>
+      <w:lvlText w:val="o"/>
+      <w:lvlJc w:val="left"/>
+      <w:pPr>
+        <w:ind w:left="5760" w:hanging="360"/>
+      </w:pPr>
+      <w:rPr>
+        <w:rFonts w:ascii="Courier New" w:hAnsi="Courier New" w:cs="Courier New" w:hint="default"/>
+      </w:rPr>
+    </w:lvl>
+    <w:lvl w:ilvl="8" w:tplc="08090005" w:tentative="1">
+      <w:start w:val="1"/>
+      <w:numFmt w:val="bullet"/>
+      <w:lvlText w:val=""/>
+      <w:lvlJc w:val="left"/>
+      <w:pPr>
+        <w:ind w:left="6480" w:hanging="360"/>
+      </w:pPr>
+      <w:rPr>
+        <w:rFonts w:ascii="Wingdings" w:hAnsi="Wingdings" w:hint="default"/>
+      </w:rPr>
+    </w:lvl>
+  </w:abstractNum>
   <w:num w:numId="1" w16cid:durableId="458034300">
     <w:abstractNumId w:val="1"/>
   </w:num>
@@ -5210,6 +6697,12 @@
   </w:num>
   <w:num w:numId="3" w16cid:durableId="2031908232">
     <w:abstractNumId w:val="2"/>
+  </w:num>
+  <w:num w:numId="4" w16cid:durableId="1863319653">
+    <w:abstractNumId w:val="3"/>
+  </w:num>
+  <w:num w:numId="5" w16cid:durableId="87506070">
+    <w:abstractNumId w:val="4"/>
   </w:num>
 </w:numbering>
 </file>
@@ -5662,6 +7155,7 @@
   <w:style w:type="character" w:default="1" w:styleId="DefaultParagraphFont">
     <w:name w:val="Default Paragraph Font"/>
     <w:uiPriority w:val="1"/>
+    <w:semiHidden/>
     <w:unhideWhenUsed/>
   </w:style>
   <w:style w:type="table" w:default="1" w:styleId="TableNormal">
@@ -6117,6 +7611,20 @@
         <w:bCs/>
       </w:rPr>
     </w:tblStylePr>
+  </w:style>
+  <w:style w:type="paragraph" w:customStyle="1" w:styleId="query-text-line">
+    <w:name w:val="query-text-line"/>
+    <w:basedOn w:val="Normal"/>
+    <w:rsid w:val="00BD1B8F"/>
+    <w:pPr>
+      <w:spacing w:before="100" w:beforeAutospacing="1" w:after="100" w:afterAutospacing="1" w:line="240" w:lineRule="auto"/>
+    </w:pPr>
+    <w:rPr>
+      <w:rFonts w:ascii="Times New Roman" w:eastAsia="Times New Roman" w:hAnsi="Times New Roman"/>
+      <w:sz w:val="24"/>
+      <w:szCs w:val="24"/>
+      <w:lang w:eastAsia="en-GB"/>
+    </w:rPr>
   </w:style>
 </w:styles>
 </file>
@@ -6437,15 +7945,6 @@
 </file>
 
 <file path=customXml/item1.xml><?xml version="1.0" encoding="utf-8"?>
-<?mso-contentType ?>
-<FormTemplates xmlns="http://schemas.microsoft.com/sharepoint/v3/contenttype/forms">
-  <Display>DocumentLibraryForm</Display>
-  <Edit>DocumentLibraryForm</Edit>
-  <New>DocumentLibraryForm</New>
-</FormTemplates>
-</file>
-
-<file path=customXml/item2.xml><?xml version="1.0" encoding="utf-8"?>
 <ct:contentTypeSchema xmlns:ct="http://schemas.microsoft.com/office/2006/metadata/contentType" xmlns:ma="http://schemas.microsoft.com/office/2006/metadata/properties/metaAttributes" ct:_="" ma:_="" ma:contentTypeName="Document" ma:contentTypeID="0x0101008BD36978BB4F4F488BD5FA448C313402" ma:contentTypeVersion="0" ma:contentTypeDescription="Create a new document." ma:contentTypeScope="" ma:versionID="a10212fdc8c798de08937403dc893db2">
   <xsd:schema xmlns:xsd="http://www.w3.org/2001/XMLSchema" xmlns:xs="http://www.w3.org/2001/XMLSchema" xmlns:p="http://schemas.microsoft.com/office/2006/metadata/properties" targetNamespace="http://schemas.microsoft.com/office/2006/metadata/properties" ma:root="true" ma:fieldsID="1b05d82d297216baf5b26c55225140df">
     <xsd:element name="properties">
@@ -6559,15 +8058,16 @@
 </ct:contentTypeSchema>
 </file>
 
-<file path=customXml/itemProps1.xml><?xml version="1.0" encoding="utf-8"?>
-<ds:datastoreItem xmlns:ds="http://schemas.openxmlformats.org/officeDocument/2006/customXml" ds:itemID="{18D30BCF-9665-46B6-99ED-05DA9414D515}">
-  <ds:schemaRefs>
-    <ds:schemaRef ds:uri="http://schemas.microsoft.com/sharepoint/v3/contenttype/forms"/>
-  </ds:schemaRefs>
-</ds:datastoreItem>
+<file path=customXml/item2.xml><?xml version="1.0" encoding="utf-8"?>
+<?mso-contentType ?>
+<FormTemplates xmlns="http://schemas.microsoft.com/sharepoint/v3/contenttype/forms">
+  <Display>DocumentLibraryForm</Display>
+  <Edit>DocumentLibraryForm</Edit>
+  <New>DocumentLibraryForm</New>
+</FormTemplates>
 </file>
 
-<file path=customXml/itemProps2.xml><?xml version="1.0" encoding="utf-8"?>
+<file path=customXml/itemProps1.xml><?xml version="1.0" encoding="utf-8"?>
 <ds:datastoreItem xmlns:ds="http://schemas.openxmlformats.org/officeDocument/2006/customXml" ds:itemID="{AC5B8B2E-791D-4959-8714-61617878BE64}">
   <ds:schemaRefs>
     <ds:schemaRef ds:uri="http://schemas.microsoft.com/office/2006/metadata/contentType"/>
@@ -6581,4 +8081,12 @@
     <ds:schemaRef ds:uri="http://schemas.microsoft.com/office/infopath/2007/PartnerControls"/>
   </ds:schemaRefs>
 </ds:datastoreItem>
+</file>
+
+<file path=customXml/itemProps2.xml><?xml version="1.0" encoding="utf-8"?>
+<ds:datastoreItem xmlns:ds="http://schemas.openxmlformats.org/officeDocument/2006/customXml" ds:itemID="{18D30BCF-9665-46B6-99ED-05DA9414D515}">
+  <ds:schemaRefs>
+    <ds:schemaRef ds:uri="http://schemas.microsoft.com/sharepoint/v3/contenttype/forms"/>
+  </ds:schemaRefs>
+</ds:datastoreItem>
 </file>
</xml_diff>